<commit_message>
Résumé header, monochrome résumé, and Experience/Projects/Education reorder
- Résumé: centred name with a single contact line, black and white, no summary
  or certifications; PDF and .docx rebuilt
- Home: Experience before Projects, Education as its own section, company-first
  job headings; nav reads Work, Projects, Contact
- Remove certifications from the site

Co-Authored-By: Claude Opus 5.5 <noreply@anthropic.com>
</commit_message>
<xml_diff>
--- a/public/Zahraa-Sadeq-Resume.docx
+++ b/public/Zahraa-Sadeq-Resume.docx
@@ -12,18 +12,10 @@
     </w:p>
     <w:p>
       <w:pPr>
-        <w:pStyle w:val="Subtitle"/>
-      </w:pPr>
-      <w:r>
-        <w:t xml:space="preserve">AI/ML Engineer · Senior Software Engineer</w:t>
-      </w:r>
-    </w:p>
-    <w:p>
-      <w:pPr>
         <w:pStyle w:val="Contact"/>
       </w:pPr>
       <w:r>
-        <w:t xml:space="preserve">Tucson, AZ | zkarem12@gmail.com | zahraasadeq.dev | linkedin.com/in/zahraa-sadeq-460199145 | github.com/ZahraaSadeqProd</w:t>
+        <w:t xml:space="preserve">(520) 404-3093 | zkarem12@gmail.com | linkedin.com/in/zahraa-sadeq-460199145 | Tucson, AZ</w:t>
       </w:r>
     </w:p>
     <w:p>
@@ -661,6 +653,7 @@
     <w:pPr>
       <w:keepNext w:val="0"/>
       <w:spacing w:before="0" w:after="20"/>
+      <w:jc w:val="center"/>
     </w:pPr>
     <w:rPr>
       <w:b/>
@@ -677,7 +670,6 @@
     </w:pPr>
     <w:rPr>
       <w:b/>
-      <w:color w:val="0D6E43"/>
       <w:sz w:val="23"/>
     </w:rPr>
   </w:style>
@@ -687,10 +679,11 @@
     <w:qFormat/>
     <w:pPr>
       <w:keepNext w:val="0"/>
-      <w:spacing w:before="0" w:after="80"/>
+      <w:spacing w:before="0" w:after="20"/>
+      <w:jc w:val="center"/>
     </w:pPr>
     <w:rPr>
-      <w:sz w:val="19"/>
+      <w:sz w:val="21"/>
     </w:rPr>
   </w:style>
   <w:style w:type="paragraph" w:styleId="Heading1">
@@ -701,13 +694,12 @@
       <w:keepNext w:val="1"/>
       <w:spacing w:before="200" w:after="80"/>
       <w:pBdr>
-        <w:bottom w:val="single" w:sz="6" w:space="1" w:color="0D6E43"/>
+        <w:bottom w:val="single" w:sz="6" w:space="1" w:color="111111"/>
       </w:pBdr>
     </w:pPr>
     <w:rPr>
       <w:b/>
       <w:caps/>
-      <w:color w:val="0D6E43"/>
       <w:sz w:val="22"/>
     </w:rPr>
   </w:style>
@@ -733,7 +725,7 @@
       <w:spacing w:before="0" w:after="40"/>
     </w:pPr>
     <w:rPr>
-      <w:color w:val="3D5A48"/>
+      <w:color w:val="444444"/>
       <w:sz w:val="19"/>
     </w:rPr>
   </w:style>

</xml_diff>